<commit_message>
Update task queue UI: square badges and matching queue duration labels
</commit_message>
<xml_diff>
--- a/Instructions/Task Queue Sim using State.docx
+++ b/Instructions/Task Queue Sim using State.docx
@@ -17,13 +17,7 @@
         </w:rPr>
       </w:pPr>
       <w:r>
-        <w:t xml:space="preserve">The supplied demonstration shows a React task-queue </w:t>
-      </w:r>
-      <w:r>
-        <w:t>application. Random tasks are added to a waiting Task Queue. Tasks have numeric values and some are visually marked as high priority. When ADMIT TASK is triggered, waiting tasks are assigned to processing queues. The interface contains one High Priority Qu</w:t>
-      </w:r>
-      <w:r>
-        <w:t>eue and several Regular Queues, each showing its queue list and a duration/progress indicator.</w:t>
+        <w:t>The supplied demonstration shows a React task-queue application. Random tasks are added to a waiting Task Queue. Tasks have numeric values and some are visually marked as high priority. When ADMIT TASK is triggered, waiting tasks are assigned to processing queues. The interface contains one High Priority Queue and several Regular Queues, each showing its queue list and a duration/progress indicator.</w:t>
       </w:r>
     </w:p>
     <w:p>
@@ -33,10 +27,7 @@
         </w:rPr>
       </w:pPr>
       <w:r>
-        <w:t>This activity is deliberately completed using React's built-in state tools first. Redux must not be introduced at this stage. The objective is for students to ex</w:t>
-      </w:r>
-      <w:r>
-        <w:t>perience state ownership, immutable array updates, derived state, queue rules, and coordination among components before learning a global state-management library.</w:t>
+        <w:t>This activity is deliberately completed using React's built-in state tools first. Redux must not be introduced at this stage. The objective is for students to experience state ownership, immutable array updates, derived state, queue rules, and coordination among components before learning a global state-management library.</w:t>
       </w:r>
     </w:p>
     <w:p>
@@ -55,10 +46,7 @@
         </w:rPr>
       </w:pPr>
       <w:r>
-        <w:t xml:space="preserve">Explain what application state is and distinguish it from </w:t>
-      </w:r>
-      <w:r>
-        <w:t>ordinary variables and props.</w:t>
+        <w:t>Explain what application state is and distinguish it from ordinary variables and props.</w:t>
       </w:r>
     </w:p>
     <w:p>
@@ -102,10 +90,7 @@
         </w:rPr>
       </w:pPr>
       <w:r>
-        <w:t>Implement FIFO queue behavior and a priori</w:t>
-      </w:r>
-      <w:r>
-        <w:t>ty admission rule.</w:t>
+        <w:t>Implement FIFO queue behavior and a priority admission rule.</w:t>
       </w:r>
     </w:p>
     <w:p>
@@ -138,10 +123,7 @@
         </w:rPr>
       </w:pPr>
       <w:r>
-        <w:t xml:space="preserve">Explain why the application can be implemented correctly without Redux at </w:t>
-      </w:r>
-      <w:r>
-        <w:t>its present scale.</w:t>
+        <w:t>Explain why the application can be implemented correctly without Redux at its present scale.</w:t>
       </w:r>
     </w:p>
     <w:p>
@@ -181,10 +163,7 @@
         </w:rPr>
       </w:pPr>
       <w:r>
-        <w:t>Ea</w:t>
-      </w:r>
-      <w:r>
-        <w:t>ch task has an id, a numeric duration/work value, and a priority such as HIGH or REGULAR.</w:t>
+        <w:t>Each task has an id, a numeric duration/work value, and a priority such as HIGH or REGULAR.</w:t>
       </w:r>
     </w:p>
     <w:p>
@@ -217,10 +196,7 @@
         </w:rPr>
       </w:pPr>
       <w:r>
-        <w:t>High Prio</w:t>
-      </w:r>
-      <w:r>
-        <w:t>rity Queue 1 receives high-priority work.</w:t>
+        <w:t>High Priority Queue 1 receives high-priority work.</w:t>
       </w:r>
     </w:p>
     <w:p>
@@ -248,60 +224,13 @@
     <w:p>
       <w:pPr>
         <w:pStyle w:val="ListBullet"/>
+        <w:rPr>
+          <w:rFonts w:hint="eastAsia"/>
+        </w:rPr>
       </w:pPr>
       <w:r>
         <w:t>State changes must immediately update the rendered interface.</w:t>
       </w:r>
-    </w:p>
-    <w:p>
-      <w:pPr>
-        <w:pStyle w:val="ListBullet"/>
-        <w:numPr>
-          <w:ilvl w:val="0"/>
-          <w:numId w:val="0"/>
-        </w:numPr>
-        <w:ind w:left="360"/>
-      </w:pPr>
-    </w:p>
-    <w:p>
-      <w:pPr>
-        <w:pStyle w:val="ListBullet"/>
-        <w:numPr>
-          <w:ilvl w:val="0"/>
-          <w:numId w:val="0"/>
-        </w:numPr>
-        <w:ind w:left="360"/>
-      </w:pPr>
-    </w:p>
-    <w:p>
-      <w:pPr>
-        <w:pStyle w:val="ListBullet"/>
-        <w:numPr>
-          <w:ilvl w:val="0"/>
-          <w:numId w:val="0"/>
-        </w:numPr>
-        <w:ind w:left="360"/>
-      </w:pPr>
-    </w:p>
-    <w:p>
-      <w:pPr>
-        <w:pStyle w:val="ListBullet"/>
-        <w:numPr>
-          <w:ilvl w:val="0"/>
-          <w:numId w:val="0"/>
-        </w:numPr>
-        <w:ind w:left="360"/>
-      </w:pPr>
-    </w:p>
-    <w:p>
-      <w:pPr>
-        <w:pStyle w:val="ListBullet"/>
-        <w:numPr>
-          <w:ilvl w:val="0"/>
-          <w:numId w:val="0"/>
-        </w:numPr>
-        <w:ind w:left="360"/>
-      </w:pPr>
     </w:p>
     <w:p>
       <w:pPr>
@@ -318,17 +247,76 @@
     </w:p>
     <w:p>
       <w:pPr>
+        <w:pStyle w:val="ListBullet"/>
+        <w:numPr>
+          <w:ilvl w:val="0"/>
+          <w:numId w:val="0"/>
+        </w:numPr>
+        <w:ind w:left="360"/>
+        <w:rPr>
+          <w:rFonts w:hint="eastAsia"/>
+        </w:rPr>
+      </w:pPr>
+    </w:p>
+    <w:p>
+      <w:pPr>
+        <w:pStyle w:val="ListBullet"/>
+        <w:numPr>
+          <w:ilvl w:val="0"/>
+          <w:numId w:val="0"/>
+        </w:numPr>
+        <w:ind w:left="360"/>
+        <w:rPr>
+          <w:rFonts w:hint="eastAsia"/>
+        </w:rPr>
+      </w:pPr>
+    </w:p>
+    <w:p>
+      <w:pPr>
+        <w:pStyle w:val="ListBullet"/>
+        <w:numPr>
+          <w:ilvl w:val="0"/>
+          <w:numId w:val="0"/>
+        </w:numPr>
+        <w:ind w:left="360"/>
+        <w:rPr>
+          <w:rFonts w:hint="eastAsia"/>
+        </w:rPr>
+      </w:pPr>
+    </w:p>
+    <w:p>
+      <w:pPr>
+        <w:pStyle w:val="ListBullet"/>
+        <w:numPr>
+          <w:ilvl w:val="0"/>
+          <w:numId w:val="0"/>
+        </w:numPr>
+        <w:ind w:left="360"/>
+        <w:rPr>
+          <w:rFonts w:hint="eastAsia"/>
+        </w:rPr>
+      </w:pPr>
+    </w:p>
+    <w:p>
+      <w:pPr>
+        <w:pStyle w:val="ListBullet"/>
+        <w:numPr>
+          <w:ilvl w:val="0"/>
+          <w:numId w:val="0"/>
+        </w:numPr>
+        <w:ind w:left="360"/>
+        <w:rPr>
+          <w:rFonts w:hint="eastAsia"/>
+        </w:rPr>
+      </w:pPr>
+    </w:p>
+    <w:p>
+      <w:pPr>
         <w:pStyle w:val="Heading1"/>
       </w:pPr>
       <w:r>
         <w:lastRenderedPageBreak/>
-        <w:t xml:space="preserve">4. </w:t>
-      </w:r>
-      <w:r>
-        <w:t>State M</w:t>
-      </w:r>
-      <w:r>
-        <w:t>anagement Before Redux</w:t>
+        <w:t>4. State Management Before Redux</w:t>
       </w:r>
     </w:p>
     <w:p>
@@ -348,9 +336,9 @@
         <w:tblLook w:val="04A0" w:firstRow="1" w:lastRow="0" w:firstColumn="1" w:lastColumn="0" w:noHBand="0" w:noVBand="1"/>
       </w:tblPr>
       <w:tblGrid>
-        <w:gridCol w:w="3360"/>
-        <w:gridCol w:w="3360"/>
-        <w:gridCol w:w="3360"/>
+        <w:gridCol w:w="3358"/>
+        <w:gridCol w:w="3355"/>
+        <w:gridCol w:w="3357"/>
       </w:tblGrid>
       <w:tr>
         <w:tc>
@@ -367,13 +355,7 @@
               <w:rPr>
                 <w:b/>
               </w:rPr>
-              <w:t>Dat</w:t>
-            </w:r>
-            <w:r>
-              <w:rPr>
-                <w:b/>
-              </w:rPr>
-              <w:t>a</w:t>
+              <w:t>Data</w:t>
             </w:r>
           </w:p>
         </w:tc>
@@ -597,10 +579,7 @@
               </w:rPr>
             </w:pPr>
             <w:r>
-              <w:t xml:space="preserve">Used to </w:t>
-            </w:r>
-            <w:r>
-              <w:t>create stable task identifiers.</w:t>
+              <w:t>Used to create stable task identifiers.</w:t>
             </w:r>
           </w:p>
         </w:tc>
@@ -741,10 +720,7 @@
               </w:rPr>
             </w:pPr>
             <w:r>
-              <w:t xml:space="preserve">Can be calculated from </w:t>
-            </w:r>
-            <w:r>
-              <w:t>array length.</w:t>
+              <w:t>Can be calculated from array length.</w:t>
             </w:r>
           </w:p>
         </w:tc>
@@ -765,10 +741,7 @@
         </w:rPr>
       </w:pPr>
       <w:r>
-        <w:t>A task may have the structure: { id, duration, priority }. Example: { id: 12, duration: 72, priority: "HIGH" }. Students may add status or createdAt if needed, but should avoid storing values that can simply be calcu</w:t>
-      </w:r>
-      <w:r>
-        <w:t>lated from existing state.</w:t>
+        <w:t>A task may have the structure: { id, duration, priority }. Example: { id: 12, duration: 72, priority: "HIGH" }. Students may add status or createdAt if needed, but should avoid storing values that can simply be calculated from existing state.</w:t>
       </w:r>
     </w:p>
     <w:p>
@@ -786,25 +759,54 @@
         </w:rPr>
       </w:pPr>
       <w:r>
-        <w:t>For this laboratory, priority affects admission order. HIGH tasks are admitted before REGULAR tasks. Within the same priority level, preserve FIFO order: the task that entered first is admitted first. This</w:t>
-      </w:r>
-      <w:r>
-        <w:t xml:space="preserve"> creates a simple priority queue without requiring a specialized library.</w:t>
+        <w:t>For this laboratory, priority affects admission order. HIGH tasks are admitted before REGULAR tasks. Within the same priority level, preserve FIFO order: the task that entered first is admitted first. This creates a simple priority queue without requiring a specialized library.</w:t>
       </w:r>
     </w:p>
     <w:p>
+      <w:pPr>
+        <w:rPr>
+          <w:rFonts w:hint="eastAsia"/>
+        </w:rPr>
+      </w:pPr>
       <w:r>
-        <w:t>Recommended rule for regular work: assign an admitted regular task to the regular queue with the smallest current total duration. If two queues have equal loads, choose the lower-num</w:t>
-      </w:r>
-      <w:r>
-        <w:t>bered queue. This makes students reason about both queueing and derived state.</w:t>
+        <w:t>Recommended rule for regular work: assign an admitted regular task to the regular queue with the smallest current total duration. If two queues have equal loads, choose the lower-numbered queue. This makes students reason about both queueing and derived state.</w:t>
       </w:r>
     </w:p>
-    <w:p/>
-    <w:p/>
-    <w:p/>
-    <w:p/>
-    <w:p/>
+    <w:p>
+      <w:pPr>
+        <w:rPr>
+          <w:rFonts w:hint="eastAsia"/>
+        </w:rPr>
+      </w:pPr>
+    </w:p>
+    <w:p>
+      <w:pPr>
+        <w:rPr>
+          <w:rFonts w:hint="eastAsia"/>
+        </w:rPr>
+      </w:pPr>
+    </w:p>
+    <w:p>
+      <w:pPr>
+        <w:rPr>
+          <w:rFonts w:hint="eastAsia"/>
+        </w:rPr>
+      </w:pPr>
+    </w:p>
+    <w:p>
+      <w:pPr>
+        <w:rPr>
+          <w:rFonts w:hint="eastAsia"/>
+        </w:rPr>
+      </w:pPr>
+    </w:p>
+    <w:p>
+      <w:pPr>
+        <w:rPr>
+          <w:rFonts w:hint="eastAsia"/>
+        </w:rPr>
+      </w:pPr>
+    </w:p>
     <w:p>
       <w:pPr>
         <w:rPr>
@@ -828,9 +830,9 @@
         <w:tblLook w:val="04A0" w:firstRow="1" w:lastRow="0" w:firstColumn="1" w:lastColumn="0" w:noHBand="0" w:noVBand="1"/>
       </w:tblPr>
       <w:tblGrid>
-        <w:gridCol w:w="3360"/>
-        <w:gridCol w:w="3360"/>
-        <w:gridCol w:w="3360"/>
+        <w:gridCol w:w="3357"/>
+        <w:gridCol w:w="3357"/>
+        <w:gridCol w:w="3356"/>
       </w:tblGrid>
       <w:tr>
         <w:tc>
@@ -962,10 +964,7 @@
               </w:rPr>
             </w:pPr>
             <w:r>
-              <w:t xml:space="preserve">Displays ADD RANDOM TASK and ADMIT </w:t>
-            </w:r>
-            <w:r>
-              <w:t>TASK.</w:t>
+              <w:t>Displays ADD RANDOM TASK and ADMIT TASK.</w:t>
             </w:r>
           </w:p>
         </w:tc>
@@ -1153,10 +1152,7 @@
               </w:rPr>
             </w:pPr>
             <w:r>
-              <w:t xml:space="preserve">Displays derived </w:t>
-            </w:r>
-            <w:r>
-              <w:t>queue duration/progress.</w:t>
+              <w:t>Displays derived queue duration/progress.</w:t>
             </w:r>
           </w:p>
         </w:tc>
@@ -1200,10 +1196,7 @@
         </w:rPr>
       </w:pPr>
       <w:r>
-        <w:t>Recreate the major layout seen in the video: controls and Task Queue on the left; High Priority Queue 1 and Regular Queues 2–4</w:t>
-      </w:r>
-      <w:r>
-        <w:t xml:space="preserve"> on the right. Build reusable components before adding behavior.</w:t>
+        <w:t>Recreate the major layout seen in the video: controls and Task Queue on the left; High Priority Queue 1 and Regular Queues 2–4 on the right. Build reusable components before adding behavior.</w:t>
       </w:r>
     </w:p>
     <w:p>
@@ -1221,10 +1214,7 @@
         </w:rPr>
       </w:pPr>
       <w:r>
-        <w:t xml:space="preserve">Create state for the waiting task array, high-priority queue, and regular queues. Start with empty arrays. Explain why changing a normal variable would not </w:t>
-      </w:r>
-      <w:r>
-        <w:t>reliably re-render the interface.</w:t>
+        <w:t>Create state for the waiting task array, high-priority queue, and regular queues. Start with empty arrays. Explain why changing a normal variable would not reliably re-render the interface.</w:t>
       </w:r>
     </w:p>
     <w:p>
@@ -1250,10 +1240,7 @@
         <w:pStyle w:val="Heading2"/>
       </w:pPr>
       <w:r>
-        <w:t>Part D — I</w:t>
-      </w:r>
-      <w:r>
-        <w:t>mplement Priority Selection (30 minutes)</w:t>
+        <w:t>Part D — Implement Priority Selection (30 minutes)</w:t>
       </w:r>
     </w:p>
     <w:p>
@@ -1263,10 +1250,7 @@
         </w:rPr>
       </w:pPr>
       <w:r>
-        <w:t xml:space="preserve">Implement a function that finds the earliest HIGH task. If one exists, it is the next task admitted. If none exists, admit the earliest REGULAR task. Remove only the selected task from waitingTasks without mutating </w:t>
-      </w:r>
-      <w:r>
-        <w:t>the original array.</w:t>
+        <w:t>Implement a function that finds the earliest HIGH task. If one exists, it is the next task admitted. If none exists, admit the earliest REGULAR task. Remove only the selected task from waitingTasks without mutating the original array.</w:t>
       </w:r>
     </w:p>
     <w:p>
@@ -1284,10 +1268,7 @@
         </w:rPr>
       </w:pPr>
       <w:r>
-        <w:t xml:space="preserve">Send HIGH tasks to High Priority Queue 1. Send REGULAR tasks to the least-loaded regular queue. Compute each regular queue's load from its task durations before deciding. Preserve FIFO </w:t>
-      </w:r>
-      <w:r>
-        <w:t>order inside each destination queue.</w:t>
+        <w:t>Send HIGH tasks to High Priority Queue 1. Send REGULAR tasks to the least-loaded regular queue. Compute each regular queue's load from its task durations before deciding. Preserve FIFO order inside each destination queue.</w:t>
       </w:r>
     </w:p>
     <w:p>
@@ -1305,10 +1286,7 @@
         </w:rPr>
       </w:pPr>
       <w:r>
-        <w:t>For each service queue, calculate its total duration with reduce(). Show the value or a proportional progress indicator. Do not maintain a separate duration state u</w:t>
-      </w:r>
-      <w:r>
-        <w:t>nless there is a justified independent reason.</w:t>
+        <w:t>For each service queue, calculate its total duration with reduce(). Show the value or a proportional progress indicator. Do not maintain a separate duration state unless there is a justified independent reason.</w:t>
       </w:r>
     </w:p>
     <w:p>
@@ -1320,14 +1298,22 @@
       </w:r>
     </w:p>
     <w:p>
+      <w:pPr>
+        <w:rPr>
+          <w:rFonts w:hint="eastAsia"/>
+        </w:rPr>
+      </w:pPr>
       <w:r>
-        <w:t>Trace one task from generation to waiting state, selection, removal, destination assignment, and re-rendering. Test repeated admissions and mixtures of HIGH and RE</w:t>
-      </w:r>
-      <w:r>
-        <w:t>GULAR tasks.</w:t>
+        <w:t>Trace one task from generation to waiting state, selection, removal, destination assignment, and re-rendering. Test repeated admissions and mixtures of HIGH and REGULAR tasks.</w:t>
       </w:r>
     </w:p>
-    <w:p/>
+    <w:p>
+      <w:pPr>
+        <w:rPr>
+          <w:rFonts w:hint="eastAsia"/>
+        </w:rPr>
+      </w:pPr>
+    </w:p>
     <w:p>
       <w:pPr>
         <w:rPr>
@@ -1385,10 +1371,7 @@
         </w:rPr>
       </w:pPr>
       <w:r>
-        <w:t xml:space="preserve">Do not </w:t>
-      </w:r>
-      <w:r>
-        <w:t>store JSX elements in state.</w:t>
+        <w:t>Do not store JSX elements in state.</w:t>
       </w:r>
     </w:p>
     <w:p>
@@ -1432,10 +1415,7 @@
         </w:rPr>
       </w:pPr>
       <w:r>
-        <w:t>Redux and other glo</w:t>
-      </w:r>
-      <w:r>
-        <w:t>bal state libraries are prohibited for this activity.</w:t>
+        <w:t>Redux and other global state libraries are prohibited for this activity.</w:t>
       </w:r>
     </w:p>
     <w:p>
@@ -1453,9 +1433,9 @@
         <w:tblLook w:val="04A0" w:firstRow="1" w:lastRow="0" w:firstColumn="1" w:lastColumn="0" w:noHBand="0" w:noVBand="1"/>
       </w:tblPr>
       <w:tblGrid>
-        <w:gridCol w:w="3360"/>
-        <w:gridCol w:w="3360"/>
-        <w:gridCol w:w="3360"/>
+        <w:gridCol w:w="3356"/>
+        <w:gridCol w:w="3357"/>
+        <w:gridCol w:w="3357"/>
       </w:tblGrid>
       <w:tr>
         <w:tc>
@@ -1602,10 +1582,7 @@
               </w:rPr>
             </w:pPr>
             <w:r>
-              <w:t>All tasks have stable ids and priority is</w:t>
-            </w:r>
-            <w:r>
-              <w:t xml:space="preserve"> visually recognizable.</w:t>
+              <w:t>All tasks have stable ids and priority is visually recognizable.</w:t>
             </w:r>
           </w:p>
         </w:tc>
@@ -1793,10 +1770,7 @@
               </w:rPr>
             </w:pPr>
             <w:r>
-              <w:t>Task move</w:t>
-            </w:r>
-            <w:r>
-              <w:t>s to the least-loaded regular queue.</w:t>
+              <w:t>Task moves to the least-loaded regular queue.</w:t>
             </w:r>
           </w:p>
         </w:tc>
@@ -1937,10 +1911,7 @@
               </w:rPr>
             </w:pPr>
             <w:r>
-              <w:t xml:space="preserve">No lost tasks, duplicates, or state </w:t>
-            </w:r>
-            <w:r>
-              <w:t>mutation symptoms occur.</w:t>
+              <w:t>No lost tasks, duplicates, or state mutation symptoms occur.</w:t>
             </w:r>
           </w:p>
         </w:tc>
@@ -2019,10 +1990,7 @@
         </w:rPr>
       </w:pPr>
       <w:r>
-        <w:t>Change the probability of generating HIGH tas</w:t>
-      </w:r>
-      <w:r>
-        <w:t>ks without changing the queue components.</w:t>
+        <w:t>Change the probability of generating HIGH tasks without changing the queue components.</w:t>
       </w:r>
     </w:p>
     <w:p>
@@ -2055,10 +2023,7 @@
         </w:rPr>
       </w:pPr>
       <w:r>
-        <w:t>Add a Remove/Clear act</w:t>
-      </w:r>
-      <w:r>
-        <w:t>ion using immutable state updates.</w:t>
+        <w:t>Add a Remove/Clear action using immutable state updates.</w:t>
       </w:r>
     </w:p>
     <w:p>
@@ -2075,20 +2040,13 @@
     <w:p>
       <w:pPr>
         <w:pStyle w:val="ListBullet"/>
+        <w:rPr>
+          <w:rFonts w:hint="eastAsia"/>
+        </w:rPr>
       </w:pPr>
       <w:r>
         <w:t>Explain and repair a deliberately introduced direct-state-mutation bug.</w:t>
       </w:r>
-    </w:p>
-    <w:p>
-      <w:pPr>
-        <w:pStyle w:val="ListBullet"/>
-        <w:numPr>
-          <w:ilvl w:val="0"/>
-          <w:numId w:val="0"/>
-        </w:numPr>
-        <w:ind w:left="360" w:hanging="360"/>
-      </w:pPr>
     </w:p>
     <w:p>
       <w:pPr>
@@ -2105,6 +2063,19 @@
     </w:p>
     <w:p>
       <w:pPr>
+        <w:pStyle w:val="ListBullet"/>
+        <w:numPr>
+          <w:ilvl w:val="0"/>
+          <w:numId w:val="0"/>
+        </w:numPr>
+        <w:ind w:left="360" w:hanging="360"/>
+        <w:rPr>
+          <w:rFonts w:hint="eastAsia"/>
+        </w:rPr>
+      </w:pPr>
+    </w:p>
+    <w:p>
+      <w:pPr>
         <w:pStyle w:val="Heading1"/>
       </w:pPr>
       <w:r>
@@ -2119,17 +2090,38 @@
         </w:rPr>
       </w:pPr>
       <w:r>
-        <w:t>1. What makes waitingTasks application state?</w:t>
+        <w:t xml:space="preserve">1. What makes </w:t>
+      </w:r>
+      <w:proofErr w:type="spellStart"/>
+      <w:r>
+        <w:t>waitingTasks</w:t>
+      </w:r>
+      <w:proofErr w:type="spellEnd"/>
+      <w:r>
+        <w:t xml:space="preserve"> application state?</w:t>
       </w:r>
     </w:p>
     <w:p>
       <w:pPr>
         <w:rPr>
+          <w:u w:val="single"/>
+        </w:rPr>
+      </w:pPr>
+      <w:proofErr w:type="spellStart"/>
+      <w:r>
+        <w:rPr>
           <w:rFonts w:hint="eastAsia"/>
+          <w:u w:val="single"/>
         </w:rPr>
-      </w:pPr>
+        <w:t>waitingTasks</w:t>
+      </w:r>
+      <w:proofErr w:type="spellEnd"/>
       <w:r>
-        <w:t>________________________________________________________________________________</w:t>
+        <w:rPr>
+          <w:rFonts w:hint="eastAsia"/>
+          <w:u w:val="single"/>
+        </w:rPr>
+        <w:t xml:space="preserve"> is application state because its value changes over time as tasks are generated or admitted, which directly triggers a UI re-render.</w:t>
       </w:r>
     </w:p>
     <w:p>
@@ -2139,20 +2131,28 @@
         </w:rPr>
       </w:pPr>
       <w:r>
-        <w:t xml:space="preserve">2. Why should the service queues and waiting queue </w:t>
-      </w:r>
-      <w:r>
-        <w:t>share a common state owner?</w:t>
+        <w:t>2. Why should the service queues and waiting queue share a common state owner?</w:t>
       </w:r>
     </w:p>
     <w:p>
       <w:pPr>
         <w:rPr>
           <w:rFonts w:hint="eastAsia"/>
+          <w:u w:val="single"/>
         </w:rPr>
       </w:pPr>
       <w:r>
-        <w:t>________________________________________________________________________________</w:t>
+        <w:rPr>
+          <w:u w:val="single"/>
+        </w:rPr>
+        <w:t>The service and waiting queues must share a common state owner so a single action can atomically remove a task from one queue and add it to another</w:t>
+      </w:r>
+      <w:r>
+        <w:rPr>
+          <w:rFonts w:hint="eastAsia"/>
+          <w:u w:val="single"/>
+        </w:rPr>
+        <w:t>.</w:t>
       </w:r>
     </w:p>
     <w:p>
@@ -2168,14 +2168,42 @@
     <w:p>
       <w:pPr>
         <w:rPr>
-          <w:rFonts w:hint="eastAsia"/>
+          <w:u w:val="single"/>
         </w:rPr>
       </w:pPr>
       <w:r>
-        <w:t>_____________________________________________________________________</w:t>
+        <w:rPr>
+          <w:u w:val="single"/>
+        </w:rPr>
+        <w:t xml:space="preserve">FIFO processes tasks strictly by arrival order, whereas priority admission processes </w:t>
       </w:r>
       <w:r>
-        <w:t>___________</w:t>
+        <w:rPr>
+          <w:rStyle w:val="HTMLCode"/>
+          <w:rFonts w:eastAsiaTheme="minorEastAsia"/>
+          <w:u w:val="single"/>
+        </w:rPr>
+        <w:t>HIGH</w:t>
+      </w:r>
+      <w:r>
+        <w:rPr>
+          <w:u w:val="single"/>
+        </w:rPr>
+        <w:t xml:space="preserve"> priority tasks ahead of </w:t>
+      </w:r>
+      <w:r>
+        <w:rPr>
+          <w:rStyle w:val="HTMLCode"/>
+          <w:rFonts w:eastAsiaTheme="minorEastAsia"/>
+          <w:u w:val="single"/>
+        </w:rPr>
+        <w:t>REGULAR</w:t>
+      </w:r>
+      <w:r>
+        <w:rPr>
+          <w:u w:val="single"/>
+        </w:rPr>
+        <w:t xml:space="preserve"> ones regardless of arrival time. </w:t>
       </w:r>
     </w:p>
     <w:p>
@@ -2191,11 +2219,15 @@
     <w:p>
       <w:pPr>
         <w:rPr>
+          <w:u w:val="single"/>
+        </w:rPr>
+      </w:pPr>
+      <w:r>
+        <w:rPr>
           <w:rFonts w:hint="eastAsia"/>
+          <w:u w:val="single"/>
         </w:rPr>
-      </w:pPr>
-      <w:r>
-        <w:t>________________________________________________________________________________</w:t>
+        <w:t xml:space="preserve">Preserving FIFO within the same priority level ensures fairness and prevents older tasks of equal urgency from being starved.   </w:t>
       </w:r>
     </w:p>
     <w:p>
@@ -2211,14 +2243,15 @@
     <w:p>
       <w:pPr>
         <w:rPr>
+          <w:u w:val="single"/>
+        </w:rPr>
+      </w:pPr>
+      <w:r>
+        <w:rPr>
           <w:rFonts w:hint="eastAsia"/>
+          <w:u w:val="single"/>
         </w:rPr>
-      </w:pPr>
-      <w:r>
-        <w:t>_______________________________</w:t>
-      </w:r>
-      <w:r>
-        <w:t>_________________________________________________</w:t>
+        <w:t xml:space="preserve">Queue duration is best treated as derived state because calculating it dynamically prevents duplicate data and synchronization bugs.   </w:t>
       </w:r>
     </w:p>
     <w:p>
@@ -2234,42 +2267,59 @@
     <w:p>
       <w:pPr>
         <w:rPr>
+          <w:u w:val="single"/>
+        </w:rPr>
+      </w:pPr>
+      <w:r>
+        <w:rPr>
           <w:rFonts w:hint="eastAsia"/>
+          <w:u w:val="single"/>
         </w:rPr>
-      </w:pPr>
+        <w:t xml:space="preserve">Calling </w:t>
+      </w:r>
+      <w:proofErr w:type="gramStart"/>
       <w:r>
-        <w:t>________________________________________________________________________________</w:t>
+        <w:rPr>
+          <w:rFonts w:hint="eastAsia"/>
+          <w:u w:val="single"/>
+        </w:rPr>
+        <w:t>splice(</w:t>
+      </w:r>
+      <w:proofErr w:type="gramEnd"/>
+      <w:r>
+        <w:rPr>
+          <w:rFonts w:hint="eastAsia"/>
+          <w:u w:val="single"/>
+        </w:rPr>
+        <w:t xml:space="preserve">) mutates the array in-place, which prevents React from detecting reference changes and updating the UI.   </w:t>
       </w:r>
     </w:p>
     <w:p>
-      <w:pPr>
-        <w:rPr>
-          <w:rFonts w:hint="eastAsia"/>
-        </w:rPr>
-      </w:pPr>
       <w:r>
-        <w:t>7. How do callback props allow a child component to cau</w:t>
-      </w:r>
-      <w:r>
-        <w:t>se a parent state change?</w:t>
+        <w:t>7. How do callback props allow a child component to cause a parent state change?</w:t>
       </w:r>
     </w:p>
     <w:p>
       <w:pPr>
         <w:rPr>
           <w:rFonts w:hint="eastAsia"/>
+          <w:u w:val="single"/>
         </w:rPr>
       </w:pPr>
       <w:r>
-        <w:t>________________________________________________________________________________</w:t>
+        <w:rPr>
+          <w:rFonts w:hint="eastAsia"/>
+          <w:u w:val="single"/>
+        </w:rPr>
+        <w:t xml:space="preserve">Callback props allow child components to execute functions passed from the parent, which triggers state updates in the parent component.   </w:t>
       </w:r>
+      <w:bookmarkStart w:id="0" w:name="_GoBack"/>
+      <w:bookmarkEnd w:id="0"/>
     </w:p>
     <w:p>
       <w:pPr>
         <w:pStyle w:val="Heading1"/>
       </w:pPr>
-      <w:bookmarkStart w:id="0" w:name="_GoBack"/>
-      <w:bookmarkEnd w:id="0"/>
       <w:r>
         <w:t>13. Assessment Rubric — 100 Points</w:t>
       </w:r>
@@ -2281,9 +2331,9 @@
         <w:tblLook w:val="04A0" w:firstRow="1" w:lastRow="0" w:firstColumn="1" w:lastColumn="0" w:noHBand="0" w:noVBand="1"/>
       </w:tblPr>
       <w:tblGrid>
-        <w:gridCol w:w="3360"/>
-        <w:gridCol w:w="3360"/>
-        <w:gridCol w:w="3360"/>
+        <w:gridCol w:w="3357"/>
+        <w:gridCol w:w="3356"/>
+        <w:gridCol w:w="3357"/>
       </w:tblGrid>
       <w:tr>
         <w:tc>
@@ -2430,10 +2480,7 @@
               </w:rPr>
             </w:pPr>
             <w:r>
-              <w:t xml:space="preserve">HIGH-first selection and FIFO </w:t>
-            </w:r>
-            <w:r>
-              <w:t>within priority.</w:t>
+              <w:t>HIGH-first selection and FIFO within priority.</w:t>
             </w:r>
           </w:p>
         </w:tc>
@@ -2591,10 +2638,7 @@
               </w:rPr>
             </w:pPr>
             <w:r>
-              <w:t xml:space="preserve">UI and </w:t>
-            </w:r>
-            <w:r>
-              <w:t>derived information</w:t>
+              <w:t>UI and derived information</w:t>
             </w:r>
           </w:p>
         </w:tc>
@@ -2680,9 +2724,6 @@
     <w:p>
       <w:pPr>
         <w:pStyle w:val="Heading1"/>
-        <w:rPr>
-          <w:rFonts w:hint="eastAsia"/>
-        </w:rPr>
       </w:pPr>
     </w:p>
     <w:sectPr>
@@ -3281,10 +3322,6 @@
     <w:lsdException w:name="Book Title" w:uiPriority="33" w:qFormat="1"/>
     <w:lsdException w:name="Bibliography" w:semiHidden="1" w:uiPriority="37" w:unhideWhenUsed="1"/>
     <w:lsdException w:name="TOC Heading" w:semiHidden="1" w:uiPriority="39" w:unhideWhenUsed="1" w:qFormat="1"/>
-    <w:lsdException w:name="Grid Table Light" w:semiHidden="1" w:unhideWhenUsed="1"/>
-    <w:lsdException w:name="Grid Table 1 Light" w:semiHidden="1" w:unhideWhenUsed="1"/>
-    <w:lsdException w:name="Grid Table 2" w:semiHidden="1" w:unhideWhenUsed="1"/>
-    <w:lsdException w:name="Grid Table 3" w:semiHidden="1" w:unhideWhenUsed="1"/>
     <w:lsdException w:name="Grid Table 4" w:uiPriority="49"/>
     <w:lsdException w:name="Grid Table 5 Dark" w:uiPriority="50"/>
     <w:lsdException w:name="Grid Table 6 Colorful" w:uiPriority="51"/>
@@ -14382,6 +14419,19 @@
         <w:shd w:val="clear" w:color="auto" w:fill="FBCAA2" w:themeFill="accent6" w:themeFillTint="7F"/>
       </w:tcPr>
     </w:tblStylePr>
+  </w:style>
+  <w:style w:type="character" w:styleId="HTMLCode">
+    <w:name w:val="HTML Code"/>
+    <w:basedOn w:val="DefaultParagraphFont"/>
+    <w:uiPriority w:val="99"/>
+    <w:semiHidden/>
+    <w:unhideWhenUsed/>
+    <w:rsid w:val="00C92FC0"/>
+    <w:rPr>
+      <w:rFonts w:ascii="Courier New" w:eastAsia="Times New Roman" w:hAnsi="Courier New" w:cs="Courier New"/>
+      <w:sz w:val="20"/>
+      <w:szCs w:val="20"/>
+    </w:rPr>
   </w:style>
 </w:styles>
 </file>
@@ -14711,7 +14761,7 @@
 </file>
 
 <file path=customXml/itemProps1.xml><?xml version="1.0" encoding="utf-8"?>
-<ds:datastoreItem xmlns:ds="http://schemas.openxmlformats.org/officeDocument/2006/customXml" ds:itemID="{53BBA09B-F36D-4ADF-ADCB-27340509C293}">
+<ds:datastoreItem xmlns:ds="http://schemas.openxmlformats.org/officeDocument/2006/customXml" ds:itemID="{0BF60E68-254E-4CF4-9ED4-F4FE35ADF46E}">
   <ds:schemaRefs>
     <ds:schemaRef ds:uri="http://schemas.openxmlformats.org/officeDocument/2006/bibliography"/>
   </ds:schemaRefs>

</xml_diff>